<commit_message>
Actualiza aplicación y documentación de Dromedario
</commit_message>
<xml_diff>
--- a/code/documentos/Manual_Usuario_Dromedario_Pedidos.docx
+++ b/code/documentos/Manual_Usuario_Dromedario_Pedidos.docx
@@ -56,9 +56,9 @@
         <w:rPr>
           <w:color w:val="555555"/>
         </w:rPr>
-        <w:t>Versión del manual: 1.0</w:t>
+        <w:t>Versión del manual: 1.1</w:t>
         <w:br/>
-        <w:t>Fecha: 09 de September de 2026</w:t>
+        <w:t>Fecha: 10 de September de 2026</w:t>
         <w:br/>
         <w:t>Ambito: Anpala SAS — Dromedario</w:t>
       </w:r>
@@ -170,6 +170,20 @@
       </w:r>
       <w:r>
         <w:t>prepara los pedidos, registra el envío y reporta la entrega o cualquier novedad.</w:t>
+      </w:r>
+    </w:p>
+    <w:p>
+      <w:pPr>
+        <w:pStyle w:val="ListBullet"/>
+      </w:pPr>
+      <w:r>
+        <w:rPr>
+          <w:b/>
+        </w:rPr>
+        <w:t xml:space="preserve">Digitador: </w:t>
+      </w:r>
+      <w:r>
+        <w:t>solo tiene acceso al módulo Clientes, para registrar y actualizar clientes, contactos y precios.</w:t>
       </w:r>
     </w:p>
     <w:p>
@@ -450,6 +464,47 @@
           </w:p>
         </w:tc>
       </w:tr>
+      <w:tr>
+        <w:tc>
+          <w:tcPr>
+            <w:tcW w:type="dxa" w:w="3249"/>
+          </w:tcPr>
+          <w:p>
+            <w:pPr>
+              <w:spacing w:after="40"/>
+            </w:pPr>
+            <w:r>
+              <w:t>Digitador</w:t>
+            </w:r>
+          </w:p>
+        </w:tc>
+        <w:tc>
+          <w:tcPr>
+            <w:tcW w:type="dxa" w:w="3249"/>
+          </w:tcPr>
+          <w:p>
+            <w:pPr>
+              <w:spacing w:after="40"/>
+            </w:pPr>
+            <w:r>
+              <w:t>Registra y actualiza clientes, contactos y precios. Sin acceso a pedidos, productos ni reportes.</w:t>
+            </w:r>
+          </w:p>
+        </w:tc>
+        <w:tc>
+          <w:tcPr>
+            <w:tcW w:type="dxa" w:w="3249"/>
+          </w:tcPr>
+          <w:p>
+            <w:pPr>
+              <w:spacing w:after="40"/>
+            </w:pPr>
+            <w:r>
+              <w:t>Ninguno — no tiene acceso al módulo Pedidos.</w:t>
+            </w:r>
+          </w:p>
+        </w:tc>
+      </w:tr>
     </w:tbl>
     <w:p/>
     <w:p>
@@ -492,6 +547,25 @@
     </w:p>
     <w:p>
       <w:pPr>
+        <w:spacing w:before="80" w:after="160"/>
+        <w:ind w:left="283"/>
+      </w:pPr>
+      <w:r>
+        <w:rPr>
+          <w:b/>
+          <w:color w:val="B57A2E"/>
+        </w:rPr>
+        <w:t xml:space="preserve">Nota: </w:t>
+      </w:r>
+      <w:r>
+        <w:rPr>
+          <w:color w:val="555555"/>
+        </w:rPr>
+        <w:t>El rol Digitador es un caso especial: al iniciar sesión solo ve el módulo Clientes — el resto del menú (Resumen, Pedidos, Productos, Reportes, Configuración) no aparece, y el sistema no permite acceder a esas secciones aunque se escriba la dirección directamente.</w:t>
+      </w:r>
+    </w:p>
+    <w:p>
+      <w:pPr>
         <w:pStyle w:val="Heading1"/>
       </w:pPr>
       <w:r>
@@ -567,6 +641,62 @@
     </w:p>
     <w:p>
       <w:pPr>
+        <w:pStyle w:val="Heading2"/>
+      </w:pPr>
+      <w:r>
+        <w:t>3.1 Mi cuenta: cambiar mi nombre o mi contraseña</w:t>
+      </w:r>
+    </w:p>
+    <w:p>
+      <w:r>
+        <w:t>Cualquier usuario, sin importar su rol, puede actualizar su propio nombre completo y cambiar su contraseña desde el botón “Mi cuenta” en la parte inferior de la barra lateral, junto a “Cerrar sesion”.</w:t>
+      </w:r>
+    </w:p>
+    <w:p>
+      <w:pPr>
+        <w:pStyle w:val="ListNumber"/>
+      </w:pPr>
+      <w:r>
+        <w:t>Pulse “Mi cuenta” en la barra lateral.</w:t>
+      </w:r>
+    </w:p>
+    <w:p>
+      <w:pPr>
+        <w:pStyle w:val="ListNumber"/>
+      </w:pPr>
+      <w:r>
+        <w:t>Para cambiar el nombre: edite el campo Nombre completo y pulse “Guardar nombre”.</w:t>
+      </w:r>
+    </w:p>
+    <w:p>
+      <w:pPr>
+        <w:pStyle w:val="ListNumber"/>
+      </w:pPr>
+      <w:r>
+        <w:t>Para cambiar la contraseña: escriba la Nueva contrasena (mínimo 6 caracteres), repítala en Confirmar contrasena y pulse “Cambiar contrasena”.</w:t>
+      </w:r>
+    </w:p>
+    <w:p>
+      <w:pPr>
+        <w:spacing w:before="80" w:after="160"/>
+        <w:ind w:left="283"/>
+      </w:pPr>
+      <w:r>
+        <w:rPr>
+          <w:b/>
+          <w:color w:val="B57A2E"/>
+        </w:rPr>
+        <w:t xml:space="preserve">Nota: </w:t>
+      </w:r>
+      <w:r>
+        <w:rPr>
+          <w:color w:val="555555"/>
+        </w:rPr>
+        <w:t>Esto es distinto de la recuperación de contraseña: aquí el usuario ya inició sesión y cambia su propia contraseña por decisión propia. Si un usuario olvidó su contraseña y no puede iniciar sesión, sigue aplicando la Nota de la sección 3: debe pedirle a un administrador que le asigne una nueva desde Configuración.</w:t>
+      </w:r>
+    </w:p>
+    <w:p>
+      <w:pPr>
         <w:pStyle w:val="Heading1"/>
       </w:pPr>
       <w:r>
@@ -901,7 +1031,7 @@
         <w:pStyle w:val="ListBullet"/>
       </w:pPr>
       <w:r>
-        <w:t>Sección “Documentos y trazabilidad” con los últimos eventos registrados (fecha, acción y nota).</w:t>
+        <w:t>Sección “Documentos y trazabilidad” con los últimos eventos registrados (fecha, acción y nota), incluyendo el adjunto original de la solicitud si se cargó uno al crear el pedido.</w:t>
       </w:r>
     </w:p>
     <w:p>
@@ -936,7 +1066,7 @@
         <w:rPr>
           <w:color w:val="555555"/>
         </w:rPr>
-        <w:t>Los archivos adjuntos se guardan de forma privada y se visualizan mediante enlaces temporales (válidos por 120 segundos) con botones como “Ver factura/remisión”, “Ver guía” o “Ver adjunto”.</w:t>
+        <w:t>Los archivos adjuntos se guardan de forma privada y se visualizan mediante enlaces temporales (válidos por 120 segundos) con botones como “Ver factura/remisión”, “Ver guía”, “Ver adjunto” o “Ver adjunto de la solicitud”. Cualquier rol que pueda ver el pedido puede abrir sus adjuntos — por ejemplo, Despacho sí puede ver la factura una vez el pedido llega a su etapa.</w:t>
       </w:r>
     </w:p>
     <w:p>
@@ -1880,6 +2010,78 @@
     </w:p>
     <w:p>
       <w:pPr>
+        <w:pStyle w:val="Heading2"/>
+      </w:pPr>
+      <w:r>
+        <w:t>6.6 Editar un pedido ya creado (solo Admin/Gerencia)</w:t>
+      </w:r>
+    </w:p>
+    <w:p>
+      <w:r>
+        <w:t>Admin/Gerencia puede corregir datos de un pedido sin necesidad de avanzarlo de estado, incluso si el pedido ya está entregado o anulado. Todo lo que se cambie queda registrado en la trazabilidad del pedido (qué campo cambió, de qué valor a cuál).</w:t>
+      </w:r>
+    </w:p>
+    <w:p>
+      <w:pPr>
+        <w:pStyle w:val="ListNumber"/>
+      </w:pPr>
+      <w:r>
+        <w:t>En el detalle del pedido, pulse “Editar” junto a “Resumen del pedido”.</w:t>
+      </w:r>
+    </w:p>
+    <w:p>
+      <w:pPr>
+        <w:pStyle w:val="ListNumber"/>
+      </w:pPr>
+      <w:r>
+        <w:t>Corrija Direccion, Fecha solicitada u Observaciones internas si es necesario.</w:t>
+      </w:r>
+    </w:p>
+    <w:p>
+      <w:pPr>
+        <w:pStyle w:val="ListNumber"/>
+      </w:pPr>
+      <w:r>
+        <w:t>Corrija Numero de factura, Numero de remision o Guia de envio, y si hace falta, reemplace el archivo adjunto de la factura/remision o de la guia.</w:t>
+      </w:r>
+    </w:p>
+    <w:p>
+      <w:pPr>
+        <w:pStyle w:val="ListNumber"/>
+      </w:pPr>
+      <w:r>
+        <w:t>Agregue, quite o cambie cantidad/precio de las líneas de producto del pedido.</w:t>
+      </w:r>
+    </w:p>
+    <w:p>
+      <w:pPr>
+        <w:pStyle w:val="ListNumber"/>
+      </w:pPr>
+      <w:r>
+        <w:t>Pulse “Guardar cambios”.</w:t>
+      </w:r>
+    </w:p>
+    <w:p>
+      <w:pPr>
+        <w:spacing w:before="80" w:after="160"/>
+        <w:ind w:left="283"/>
+      </w:pPr>
+      <w:r>
+        <w:rPr>
+          <w:b/>
+          <w:color w:val="B57A2E"/>
+        </w:rPr>
+        <w:t xml:space="preserve">Nota: </w:t>
+      </w:r>
+      <w:r>
+        <w:rPr>
+          <w:color w:val="555555"/>
+        </w:rPr>
+        <w:t>Esta edición es distinta de los botones de “Actualizar estado”: no mueve el pedido de etapa, solo corrige datos. Cada cambio queda como un evento “Pedido editado por admin” en la trazabilidad, por ejemplo: “Factura: "12345" -&gt; "54321"” o “Agregado: Aceite de coco (1 x $25.000)”.</w:t>
+      </w:r>
+    </w:p>
+    <w:p>
+      <w:pPr>
         <w:pStyle w:val="Heading1"/>
       </w:pPr>
       <w:r>
@@ -2010,7 +2212,44 @@
         <w:pStyle w:val="Heading2"/>
       </w:pPr>
       <w:r>
-        <w:t>7.4 Sección Contexto</w:t>
+        <w:t>7.4 Sección Solicitado por</w:t>
+      </w:r>
+    </w:p>
+    <w:p>
+      <w:r>
+        <w:t>Para registrar quién hizo la solicitud cuando es una persona distinta del contacto principal — por ejemplo, la gerente de compras es el contacto negociado, pero quien realmente emite la orden es su asistente. Es solo un dato de referencia del pedido: no crea un contacto nuevo en Clientes.</w:t>
+      </w:r>
+    </w:p>
+    <w:p>
+      <w:pPr>
+        <w:pStyle w:val="ListBullet"/>
+      </w:pPr>
+      <w:r>
+        <w:t>Nombre (opcional).</w:t>
+      </w:r>
+    </w:p>
+    <w:p>
+      <w:pPr>
+        <w:pStyle w:val="ListBullet"/>
+      </w:pPr>
+      <w:r>
+        <w:t>Celular (opcional).</w:t>
+      </w:r>
+    </w:p>
+    <w:p>
+      <w:pPr>
+        <w:pStyle w:val="ListBullet"/>
+      </w:pPr>
+      <w:r>
+        <w:t>Correo (opcional).</w:t>
+      </w:r>
+    </w:p>
+    <w:p>
+      <w:pPr>
+        <w:pStyle w:val="Heading2"/>
+      </w:pPr>
+      <w:r>
+        <w:t>7.5 Sección Contexto</w:t>
       </w:r>
     </w:p>
     <w:p>
@@ -2031,10 +2270,18 @@
     </w:p>
     <w:p>
       <w:pPr>
+        <w:pStyle w:val="ListBullet"/>
+      </w:pPr>
+      <w:r>
+        <w:t>Adjunto (orden de compra o captura de WhatsApp): opcional, para dejar la evidencia original de la solicitud desde el momento en que se crea el pedido.</w:t>
+      </w:r>
+    </w:p>
+    <w:p>
+      <w:pPr>
         <w:pStyle w:val="Heading2"/>
       </w:pPr>
       <w:r>
-        <w:t>7.5 Guardar el pedido</w:t>
+        <w:t>7.6 Guardar el pedido</w:t>
       </w:r>
     </w:p>
     <w:p>
@@ -2082,6 +2329,25 @@
     </w:p>
     <w:p>
       <w:pPr>
+        <w:spacing w:before="80" w:after="160"/>
+        <w:ind w:left="283"/>
+      </w:pPr>
+      <w:r>
+        <w:rPr>
+          <w:b/>
+          <w:color w:val="B57A2E"/>
+        </w:rPr>
+        <w:t xml:space="preserve">Nota: </w:t>
+      </w:r>
+      <w:r>
+        <w:rPr>
+          <w:color w:val="555555"/>
+        </w:rPr>
+        <w:t>Si navega a otra página antes de guardar, lo que haya escrito en el formulario queda guardado como borrador y se restaura automáticamente cuando vuelva a “Nuevo pedido” — no se pierde el trabajo en curso.</w:t>
+      </w:r>
+    </w:p>
+    <w:p>
+      <w:pPr>
         <w:pStyle w:val="Heading1"/>
       </w:pPr>
       <w:r>
@@ -2123,6 +2389,25 @@
       </w:pPr>
       <w:r>
         <w:t>Pulse “Guardar cliente”.</w:t>
+      </w:r>
+    </w:p>
+    <w:p>
+      <w:pPr>
+        <w:spacing w:before="80" w:after="160"/>
+        <w:ind w:left="283"/>
+      </w:pPr>
+      <w:r>
+        <w:rPr>
+          <w:b/>
+          <w:color w:val="B57A2E"/>
+        </w:rPr>
+        <w:t xml:space="preserve">Nota: </w:t>
+      </w:r>
+      <w:r>
+        <w:rPr>
+          <w:color w:val="555555"/>
+        </w:rPr>
+        <w:t>Si sale de esta pantalla antes de guardar (por ejemplo, para consultar un dato del cliente en otra pestaña), lo que haya escrito queda como borrador y se restaura automáticamente al volver a abrir “Nuevo cliente”.</w:t>
       </w:r>
     </w:p>
     <w:p>
@@ -2242,7 +2527,7 @@
     </w:p>
     <w:p>
       <w:r>
-        <w:t>Catálogo administrativo de productos disponibles para armar pedidos.</w:t>
+        <w:t>Catálogo administrativo de productos disponibles para armar pedidos. Este módulo es exclusivo de Admin/Gerencia: los demás roles no lo ven en el menú ni pueden crear o editar productos, aunque sí pueden elegirlos al armar un pedido.</w:t>
       </w:r>
     </w:p>
     <w:p>
@@ -2415,7 +2700,58 @@
         <w:rPr>
           <w:color w:val="555555"/>
         </w:rPr>
-        <w:t>Comunique la contraseña temporal al usuario por un canal seguro; el sistema no envía correos automáticos de bienvenida.</w:t>
+        <w:t>Comunique la contraseña temporal al usuario por un canal seguro; el sistema no envía correos automáticos de bienvenida. El usuario puede cambiar esa contraseña por una propia en cualquier momento desde “Mi cuenta” (ver sección 3.1).</w:t>
+      </w:r>
+    </w:p>
+    <w:p>
+      <w:pPr>
+        <w:pStyle w:val="Heading2"/>
+      </w:pPr>
+      <w:r>
+        <w:t>11.2 Editar un usuario existente</w:t>
+      </w:r>
+    </w:p>
+    <w:p>
+      <w:pPr>
+        <w:pStyle w:val="ListNumber"/>
+      </w:pPr>
+      <w:r>
+        <w:t>Pulse “Editar” en la fila del usuario.</w:t>
+      </w:r>
+    </w:p>
+    <w:p>
+      <w:pPr>
+        <w:pStyle w:val="ListNumber"/>
+      </w:pPr>
+      <w:r>
+        <w:t>Actualice Nombre completo, Rol o el estado Usuario activo.</w:t>
+      </w:r>
+    </w:p>
+    <w:p>
+      <w:pPr>
+        <w:pStyle w:val="ListNumber"/>
+      </w:pPr>
+      <w:r>
+        <w:t>Pulse “Guardar cambios”.</w:t>
+      </w:r>
+    </w:p>
+    <w:p>
+      <w:pPr>
+        <w:spacing w:before="80" w:after="160"/>
+        <w:ind w:left="283"/>
+      </w:pPr>
+      <w:r>
+        <w:rPr>
+          <w:b/>
+          <w:color w:val="B57A2E"/>
+        </w:rPr>
+        <w:t xml:space="preserve">Nota: </w:t>
+      </w:r>
+      <w:r>
+        <w:rPr>
+          <w:color w:val="555555"/>
+        </w:rPr>
+        <w:t>Desactivar a un usuario (desmarcar “Usuario activo”) le impide operar en el sistema sin necesidad de borrar su cuenta ni su historial.</w:t>
       </w:r>
     </w:p>
     <w:p>
@@ -2460,7 +2796,7 @@
         <w:pStyle w:val="ListBullet"/>
       </w:pPr>
       <w:r>
-        <w:t>No hay recuperación de contraseña autoservicio; debe solicitarse a un administrador.</w:t>
+        <w:t>No hay recuperación de contraseña autoservicio para un usuario que no puede iniciar sesión (olvidó su contraseña); en ese caso debe solicitarse a un administrador. Un usuario que sí tiene sesión activa puede cambiar su propia contraseña libremente desde “Mi cuenta”.</w:t>
       </w:r>
     </w:p>
     <w:p>
@@ -2693,6 +3029,34 @@
             </w:pPr>
             <w:r>
               <w:t>Precio negociado y fijo que se le aplica a un cliente para un producto, distinto del precio base de catálogo.</w:t>
+            </w:r>
+          </w:p>
+        </w:tc>
+      </w:tr>
+      <w:tr>
+        <w:tc>
+          <w:tcPr>
+            <w:tcW w:type="dxa" w:w="4873"/>
+          </w:tcPr>
+          <w:p>
+            <w:pPr>
+              <w:spacing w:after="40"/>
+            </w:pPr>
+            <w:r>
+              <w:t>Digitador</w:t>
+            </w:r>
+          </w:p>
+        </w:tc>
+        <w:tc>
+          <w:tcPr>
+            <w:tcW w:type="dxa" w:w="4873"/>
+          </w:tcPr>
+          <w:p>
+            <w:pPr>
+              <w:spacing w:after="40"/>
+            </w:pPr>
+            <w:r>
+              <w:t>Rol de captura de datos, con acceso únicamente al módulo Clientes.</w:t>
             </w:r>
           </w:p>
         </w:tc>

</xml_diff>